<commit_message>
Built site for gh-pages
</commit_message>
<xml_diff>
--- a/assets/template-docx-report.docx
+++ b/assets/template-docx-report.docx
@@ -31,7 +31,7 @@
         <w:pStyle w:val="Date"/>
       </w:pPr>
       <w:r>
-        <w:t xml:space="preserve">June 23, 2026</w:t>
+        <w:t xml:space="preserve">July 9, 2026</w:t>
       </w:r>
     </w:p>
     <w:sdt>
@@ -267,7 +267,7 @@
         <w:t xml:space="preserve"> </w:t>
       </w:r>
       <w:r>
-        <w:t xml:space="preserve">June 2026</w:t>
+        <w:t xml:space="preserve">July 2026</w:t>
       </w:r>
     </w:p>
     <w:bookmarkEnd w:id="43"/>

</xml_diff>